<commit_message>
Populate author metadata (Onishi Tatsuki, Shiga University, ORCID) in manuscript, .zenodo.json, CITATION.cff
Co-Authored-By: Tatsuki Onishi <bougtoir@gmail.com>
</commit_message>
<xml_diff>
--- a/discharged_secrets_ijcip/output/Cover_Letter_DataPolicy.docx
+++ b/discharged_secrets_ijcip/output/Cover_Letter_DataPolicy.docx
@@ -7,7 +7,7 @@
         <w:spacing w:after="40"/>
       </w:pPr>
       <w:r>
-        <w:t>[Author name]</w:t>
+        <w:t>Onishi Tatsuki</w:t>
       </w:r>
     </w:p>
     <w:p>
@@ -15,7 +15,7 @@
         <w:spacing w:after="40"/>
       </w:pPr>
       <w:r>
-        <w:t>[Department, institution, city, postal code, country]</w:t>
+        <w:t>Data Science and AI Innovation Research Promotion Center, Shiga University, Hikone, Japan</w:t>
       </w:r>
     </w:p>
     <w:p>
@@ -23,7 +23,7 @@
         <w:spacing w:after="40"/>
       </w:pPr>
       <w:r>
-        <w:t>[Corresponding author email]</w:t>
+        <w:t>bougtoir@gmail.com</w:t>
       </w:r>
     </w:p>
     <w:p>
@@ -31,7 +31,7 @@
         <w:spacing w:after="40"/>
       </w:pPr>
       <w:r>
-        <w:t>ORCID: [ORCID]</w:t>
+        <w:t>ORCID: 0000-0001-7261-9062</w:t>
       </w:r>
     </w:p>
     <w:p>
@@ -111,7 +111,7 @@
     </w:p>
     <w:p>
       <w:r>
-        <w:t>[Author name]</w:t>
+        <w:t>Onishi Tatsuki</w:t>
       </w:r>
     </w:p>
     <w:sectPr>

</xml_diff>